<commit_message>
Update Bible resource data for 2026-08-04 release
</commit_message>
<xml_diff>
--- a/apd/docx/41.content.docx
+++ b/apd/docx/41.content.docx
@@ -50,7 +50,7 @@
         <w:rPr>
           <w:lang w:val="ar_AE" w:bidi="ar_AE"/>
         </w:rPr>
-        <w:t xml:space="preserve"> © 2023 SRV Partners Released under CC BY-SA 4.0 license. </w:t>
+        <w:t xml:space="preserve"> © 2025 Word Collective Released under CC BY-SA 4.0 license. </w:t>
       </w:r>
       <w:r>
         <w:rPr>
@@ -74,7 +74,7 @@
         <w:rPr>
           <w:lang w:val="ar_AE" w:bidi="ar_AE"/>
         </w:rPr>
-        <w:t xml:space="preserve"> © 2023 SRV Partners Released under CC BY-SA 4.0 license by Mission Mutual</w:t>
+        <w:t xml:space="preserve"> © 2025 Word Collective Released under CC BY-SA 4.0 license by Mission Mutual</w:t>
       </w:r>
       <w:r>
         <w:rPr>

</xml_diff>